<commit_message>
FR.225: add audit team sig markers to all 9 templates
Opening/Closing Signature cells for Lead Auditor, Auditor[0/1],
Technical Expert[0] were completely empty — pdfplumber detected nothing.
Added [SIG:ORG_OPENING/CLOSING_LEAD_AUDITOR/AUDITOR_N/TE_N] to each.
</commit_message>
<xml_diff>
--- a/backend/uaf_blank_set/13485/Initial Certification /Stage 1/FR.225_Opening_Closing_Meeting_Form-R7&09.10.2025.docx
+++ b/backend/uaf_blank_set/13485/Initial Certification /Stage 1/FR.225_Opening_Closing_Meeting_Form-R7&09.10.2025.docx
@@ -5045,6 +5045,9 @@
                 <w:lang w:val="en-GB" w:eastAsia="en-US"/>
               </w:rPr>
             </w:pPr>
+            <w:r>
+              <w:t xml:space="preserve">[SIG:ORG_OPENING_LEAD_AUDITOR]</w:t>
+            </w:r>
           </w:p>
         </w:tc>
         <w:tc>
@@ -5067,6 +5070,9 @@
                 <w:lang w:val="en-GB" w:eastAsia="en-US"/>
               </w:rPr>
             </w:pPr>
+            <w:r>
+              <w:t xml:space="preserve">[SIG:ORG_CLOSING_LEAD_AUDITOR]</w:t>
+            </w:r>
           </w:p>
         </w:tc>
       </w:tr>
@@ -5308,6 +5314,9 @@
                 <w:lang w:val="en-GB" w:eastAsia="en-US"/>
               </w:rPr>
             </w:pPr>
+            <w:r>
+              <w:t xml:space="preserve">[SIG:ORG_OPENING_AUDITOR_0]</w:t>
+            </w:r>
           </w:p>
         </w:tc>
         <w:tc>
@@ -5330,6 +5339,9 @@
                 <w:lang w:val="en-GB" w:eastAsia="en-US"/>
               </w:rPr>
             </w:pPr>
+            <w:r>
+              <w:t xml:space="preserve">[SIG:ORG_CLOSING_AUDITOR_0]</w:t>
+            </w:r>
           </w:p>
         </w:tc>
       </w:tr>
@@ -5669,6 +5681,9 @@
                 <w:lang w:val="en-GB" w:eastAsia="en-US"/>
               </w:rPr>
             </w:pPr>
+            <w:r>
+              <w:t xml:space="preserve">[SIG:ORG_OPENING_AUDITOR_1]</w:t>
+            </w:r>
           </w:p>
         </w:tc>
         <w:tc>
@@ -5691,6 +5706,9 @@
                 <w:lang w:val="en-GB" w:eastAsia="en-US"/>
               </w:rPr>
             </w:pPr>
+            <w:r>
+              <w:t xml:space="preserve">[SIG:ORG_CLOSING_AUDITOR_1]</w:t>
+            </w:r>
           </w:p>
         </w:tc>
       </w:tr>
@@ -5864,6 +5882,9 @@
                 <w:lang w:val="en-GB" w:eastAsia="en-US"/>
               </w:rPr>
             </w:pPr>
+            <w:r>
+              <w:t xml:space="preserve">[SIG:ORG_OPENING_TE_0]</w:t>
+            </w:r>
           </w:p>
         </w:tc>
         <w:tc>
@@ -5886,6 +5907,9 @@
                 <w:lang w:val="en-GB" w:eastAsia="en-US"/>
               </w:rPr>
             </w:pPr>
+            <w:r>
+              <w:t xml:space="preserve">[SIG:ORG_CLOSING_TE_0]</w:t>
+            </w:r>
           </w:p>
         </w:tc>
       </w:tr>
@@ -6057,6 +6081,9 @@
                 <w:lang w:val="en-GB" w:eastAsia="en-US"/>
               </w:rPr>
             </w:pPr>
+            <w:r>
+              <w:t xml:space="preserve">[SIG:ORG_OPENING_TE_0]</w:t>
+            </w:r>
           </w:p>
         </w:tc>
         <w:tc>
@@ -6079,6 +6106,9 @@
                 <w:lang w:val="en-GB" w:eastAsia="en-US"/>
               </w:rPr>
             </w:pPr>
+            <w:r>
+              <w:t xml:space="preserve">[SIG:ORG_CLOSING_TE_0]</w:t>
+            </w:r>
           </w:p>
         </w:tc>
       </w:tr>

</xml_diff>